<commit_message>
feat: AC central destruido por caída torre 24/06/2026 — evaluación integrada
- Ficha actualizada: estado NO APTO incluye unidad central A/C 20-30TR destruida por colapso torre UMC-ED-003 (CUL-TOO-02), refrigerante R-410A liberado, requiere retiro escombros + reposición 25TR
- Tabla codificada: C-39 MEC01 DESTRUIDA 🔴 + C-51 ductería + C-52 torre colapsada (52 registros)
- Diagnóstico: AG5 pasa a Electromecánica (18-28k USD equipo +8-12k ductería, manejo COVENIN3296/Montreal, CCM relé sísmico), AG1/AG4/AG6 actualizados, mapa daños nueva zona patio técnico 26-40k USD
- Lámina HTML: banda alerta A/C, ficha climatización, mapa daños patio técnico, obs6 ampliada, resumen ROJO, tabla 51-52
- Exportables regenerados PDF/DOCX/CSV 52 registros — mantiene CSS P04 exacto 5.2MB estandarizado

Co-authored-by: arena-agent <297053741+arena-agent@users.noreply.github.com>
</commit_message>
<xml_diff>
--- a/exports/LAMINA_CATASTRAL_VALIDADA_AUDITORIO_CUL-AUM-02_UMC-ED-007.docx
+++ b/exports/LAMINA_CATASTRAL_VALIDADA_AUDITORIO_CUL-AUM-02_UMC-ED-007.docx
@@ -264,7 +264,7 @@
               <w:rPr>
                 <w:sz w:val="12"/>
               </w:rPr>
-              <w:t>Sala principal con 300 butacas (15 filas × 20); Escenario 8×5 m con estrado; Vestíbulo / foyer central 40 m²; Palco oficial elevado 20 m² (2 laterales); Camerinos (2 detrás de escenario); Galería de Honor; 2 escaleras laterales (Norte y Sur, ancho ~1.20 m); 2 baterías sanitarias separadas por sexo; Biblioteca y administración (cuerpos adyacentes Fracción 1 — a verificar linderos); Caja de incendio (red Hidroven) IMG_2243 P03-L9-A</w:t>
+              <w:t>Sala principal con 300 butacas (15 filas × 20); Escenario 8×5 m con estrado; Vestíbulo / foyer central 40 m²; Palco oficial elevado 20 m² (2 laterales); Camerinos (2 detrás de escenario); Galería de Honor; 2 escaleras laterales (Norte y Sur, ancho ~1.20 m); 2 baterías sanitarias separadas por sexo; Biblioteca y administración (cuerpos adyacentes Fracción 1 — a verificar linderos); Caja de incendio (red Hidroven) IMG_2243 P03-L9-A; Unidad central A/C (destruida 24/06/2026 por caída torre UMC-ED-003 — a reponer); Ductería principal y difusores en plafond Travacustic (posible afectación por escombros — a inspeccionar tras retiro plafond)</w:t>
             </w:r>
           </w:p>
         </w:tc>
@@ -320,7 +320,7 @@
               <w:rPr>
                 <w:sz w:val="12"/>
               </w:rPr>
-              <w:t>Nominal: Íntegro — Activo (1958-2026 funcionamiento continuo) — Actual: NO APTO para actos ceremoniales y académicos tras doblete sísmico 24/06/2026 (M7.2 + M7.5). Fisuras en revestimiento, desprendimientos parciales de plafond Travacustic y techo deflector (1958), fisuras diagonales en mampostería. Requiere retiro controlado de revestimiento, inspección intrusiva y reforzamiento. — Riesgo: ROJO — Uso restringido hasta inspección estructural colegiada (CIV) y ensayo patológico</w:t>
+              <w:t>Nominal: Íntegro — Activo (1958-2026 funcionamiento continuo) — Actual: NO APTO para actos ceremoniales y académicos tras doblete 24/06/2026 (M7.2 + M7.5). Fisuras en revestimiento, desprendimientos parciales de plafond Travacustic y techo deflector 1958, fisuras diagonales en mampostería. Unidad central de A/C destruida por colapso de Torre de Observación (escombros sobre equipo, ductería y acometida). Requiere retiro controlado de revestimiento + escombros torre/AC, inspección intrusiva, reforzamiento y reposición integral climatización. — Riesgo: ROJO — Uso restringido hasta inspección estructural + peritaje electromecánico y manejo ambiental refrigerante</w:t>
             </w:r>
           </w:p>
         </w:tc>
@@ -4062,20 +4062,33 @@
               <w:rPr>
                 <w:sz w:val="10"/>
               </w:rPr>
-              <w:t>Eléctrico (CORPOELEC)</w:t>
-            </w:r>
-          </w:p>
-        </w:tc>
-        <w:tc>
-          <w:tcPr>
-            <w:tcW w:type="dxa" w:w="1234"/>
-          </w:tcPr>
-          <w:p>
-            <w:r>
-              <w:rPr>
-                <w:sz w:val="10"/>
-              </w:rPr>
-              <w:t>Tubos fluorescentes plafond + acometida a verificar</w:t>
+              <w:t>Climatización central A/C</w:t>
+            </w:r>
+          </w:p>
+        </w:tc>
+        <w:tc>
+          <w:tcPr>
+            <w:tcW w:type="dxa" w:w="1234"/>
+          </w:tcPr>
+          <w:p>
+            <w:r>
+              <w:rPr>
+                <w:sz w:val="10"/>
+              </w:rPr>
+              <w:t>Unidad central 20-30 TR + ductería plafond — Destruida 24/06/2026 por colapso torre UMC-ED-003</w:t>
+            </w:r>
+          </w:p>
+        </w:tc>
+        <w:tc>
+          <w:tcPr>
+            <w:tcW w:type="dxa" w:w="1234"/>
+          </w:tcPr>
+          <w:p>
+            <w:r>
+              <w:rPr>
+                <w:sz w:val="10"/>
+              </w:rPr>
+              <w:t>DESTRUIDA 🔴</w:t>
             </w:r>
           </w:p>
         </w:tc>
@@ -4101,33 +4114,20 @@
               <w:rPr>
                 <w:sz w:val="10"/>
               </w:rPr>
-              <w:t>—</w:t>
-            </w:r>
-          </w:p>
-        </w:tc>
-        <w:tc>
-          <w:tcPr>
-            <w:tcW w:type="dxa" w:w="1234"/>
-          </w:tcPr>
-          <w:p>
-            <w:r>
-              <w:rPr>
-                <w:sz w:val="10"/>
-              </w:rPr>
-              <w:t>UMC-ED-007-I03</w:t>
-            </w:r>
-          </w:p>
-        </w:tc>
-        <w:tc>
-          <w:tcPr>
-            <w:tcW w:type="dxa" w:w="1234"/>
-          </w:tcPr>
-          <w:p>
-            <w:r>
-              <w:rPr>
-                <w:sz w:val="10"/>
-              </w:rPr>
-              <w:t>⚠️ Parcial</w:t>
+              <w:t>UMC-ED-007-MEC01</w:t>
+            </w:r>
+          </w:p>
+        </w:tc>
+        <w:tc>
+          <w:tcPr>
+            <w:tcW w:type="dxa" w:w="1234"/>
+          </w:tcPr>
+          <w:p>
+            <w:r>
+              <w:rPr>
+                <w:sz w:val="10"/>
+              </w:rPr>
+              <w:t>🔴 Destruida</w:t>
             </w:r>
           </w:p>
         </w:tc>
@@ -5151,6 +5151,192 @@
                 <w:sz w:val="10"/>
               </w:rPr>
               <w:t>✅</w:t>
+            </w:r>
+          </w:p>
+        </w:tc>
+      </w:tr>
+      <w:tr>
+        <w:tc>
+          <w:tcPr>
+            <w:tcW w:type="dxa" w:w="1234"/>
+          </w:tcPr>
+          <w:p>
+            <w:r>
+              <w:rPr>
+                <w:sz w:val="10"/>
+              </w:rPr>
+              <w:t>C-51</w:t>
+            </w:r>
+          </w:p>
+        </w:tc>
+        <w:tc>
+          <w:tcPr>
+            <w:tcW w:type="dxa" w:w="1234"/>
+          </w:tcPr>
+          <w:p>
+            <w:r>
+              <w:rPr>
+                <w:sz w:val="10"/>
+              </w:rPr>
+              <w:t>Ductería y difusores</w:t>
+            </w:r>
+          </w:p>
+        </w:tc>
+        <w:tc>
+          <w:tcPr>
+            <w:tcW w:type="dxa" w:w="1234"/>
+          </w:tcPr>
+          <w:p>
+            <w:r>
+              <w:rPr>
+                <w:sz w:val="10"/>
+              </w:rPr>
+              <w:t>Red ductos en plafond Travacustic — posible abolladura/rotura por escombros torre</w:t>
+            </w:r>
+          </w:p>
+        </w:tc>
+        <w:tc>
+          <w:tcPr>
+            <w:tcW w:type="dxa" w:w="1234"/>
+          </w:tcPr>
+          <w:p>
+            <w:r>
+              <w:rPr>
+                <w:sz w:val="10"/>
+              </w:rPr>
+              <w:t>A inspeccionar</w:t>
+            </w:r>
+          </w:p>
+        </w:tc>
+        <w:tc>
+          <w:tcPr>
+            <w:tcW w:type="dxa" w:w="1234"/>
+          </w:tcPr>
+          <w:p>
+            <w:r>
+              <w:rPr>
+                <w:sz w:val="10"/>
+              </w:rPr>
+              <w:t>—</w:t>
+            </w:r>
+          </w:p>
+        </w:tc>
+        <w:tc>
+          <w:tcPr>
+            <w:tcW w:type="dxa" w:w="1234"/>
+          </w:tcPr>
+          <w:p>
+            <w:r>
+              <w:rPr>
+                <w:sz w:val="10"/>
+              </w:rPr>
+              <w:t>UMC-ED-007-MEC02</w:t>
+            </w:r>
+          </w:p>
+        </w:tc>
+        <w:tc>
+          <w:tcPr>
+            <w:tcW w:type="dxa" w:w="1234"/>
+          </w:tcPr>
+          <w:p>
+            <w:r>
+              <w:rPr>
+                <w:sz w:val="10"/>
+              </w:rPr>
+              <w:t>⚠️ Crit</w:t>
+            </w:r>
+          </w:p>
+        </w:tc>
+      </w:tr>
+      <w:tr>
+        <w:tc>
+          <w:tcPr>
+            <w:tcW w:type="dxa" w:w="1234"/>
+          </w:tcPr>
+          <w:p>
+            <w:r>
+              <w:rPr>
+                <w:sz w:val="10"/>
+              </w:rPr>
+              <w:t>C-52</w:t>
+            </w:r>
+          </w:p>
+        </w:tc>
+        <w:tc>
+          <w:tcPr>
+            <w:tcW w:type="dxa" w:w="1234"/>
+          </w:tcPr>
+          <w:p>
+            <w:r>
+              <w:rPr>
+                <w:sz w:val="10"/>
+              </w:rPr>
+              <w:t>Torre Observación vinculada</w:t>
+            </w:r>
+          </w:p>
+        </w:tc>
+        <w:tc>
+          <w:tcPr>
+            <w:tcW w:type="dxa" w:w="1234"/>
+          </w:tcPr>
+          <w:p>
+            <w:r>
+              <w:rPr>
+                <w:sz w:val="10"/>
+              </w:rPr>
+              <w:t>CUL-TOO-02 / UMC-ED-003 colapso parcial 24/06/2026 — impacto sobre AC y auditorio</w:t>
+            </w:r>
+          </w:p>
+        </w:tc>
+        <w:tc>
+          <w:tcPr>
+            <w:tcW w:type="dxa" w:w="1234"/>
+          </w:tcPr>
+          <w:p>
+            <w:r>
+              <w:rPr>
+                <w:sz w:val="10"/>
+              </w:rPr>
+              <w:t>Colapsada</w:t>
+            </w:r>
+          </w:p>
+        </w:tc>
+        <w:tc>
+          <w:tcPr>
+            <w:tcW w:type="dxa" w:w="1234"/>
+          </w:tcPr>
+          <w:p>
+            <w:r>
+              <w:rPr>
+                <w:sz w:val="10"/>
+              </w:rPr>
+              <w:t>CUL-TOO-02</w:t>
+            </w:r>
+          </w:p>
+        </w:tc>
+        <w:tc>
+          <w:tcPr>
+            <w:tcW w:type="dxa" w:w="1234"/>
+          </w:tcPr>
+          <w:p>
+            <w:r>
+              <w:rPr>
+                <w:sz w:val="10"/>
+              </w:rPr>
+              <w:t>UMC-ED-003</w:t>
+            </w:r>
+          </w:p>
+        </w:tc>
+        <w:tc>
+          <w:tcPr>
+            <w:tcW w:type="dxa" w:w="1234"/>
+          </w:tcPr>
+          <w:p>
+            <w:r>
+              <w:rPr>
+                <w:sz w:val="10"/>
+              </w:rPr>
+              <w:t>🔴</w:t>
             </w:r>
           </w:p>
         </w:tc>

</xml_diff>